<commit_message>
Atualização das listas segundo diretriz pedagócica
</commit_message>
<xml_diff>
--- a/Listas/Lista 03 - Comandos Imperativos.docx
+++ b/Listas/Lista 03 - Comandos Imperativos.docx
@@ -76,7 +76,7 @@
         <w:rPr>
           <w:rFonts w:ascii="Arial" w:hAnsi="Arial" w:cs="Arial"/>
         </w:rPr>
-        <w:t xml:space="preserve">Ler uma temperatura em graus Celsius e apresentá-la convertida em graus Fahrenheit. A fórmula de conversão é: F=(9*C+160) / 5, sendo F a temperatura em Fahrenheit e C a temperatura em Celsius. </w:t>
+        <w:t>A empresa Treina Recife remunera seus professores por hora, logo precisa que você escreva um programa que receba do teclado a quantidade de horas trabalhadas por um professor no mês e o valor da hora trabalhada. Calcular e exibir na tela o valor que o professor irá receber naquele mês.</w:t>
       </w:r>
     </w:p>
     <w:p>
@@ -95,7 +95,7 @@
         <w:rPr>
           <w:rFonts w:ascii="Arial" w:hAnsi="Arial" w:cs="Arial"/>
         </w:rPr>
-        <w:t>Elaborar um programa que efetue a apresentação do valor da conversão em real (R$) de um valor lido em dólar (US$). O programa deverá solicitar o valor da cotação do dólar e a quantidade de dólares disponíveis com o usuário.</w:t>
+        <w:t>A Treina Recife decorrente dos recentes aumentos de custos operacionais irá promover um aumento de 7.5% nos seus cursos de curta duração. Portanto, elabore um programa para receber via teclado o nome do curso e o valor atual em reais praticado. Ao final calcule e exiba o nome do curso e o novo valor com o aumento.</w:t>
       </w:r>
     </w:p>
     <w:p>
@@ -114,7 +114,7 @@
         <w:rPr>
           <w:rFonts w:ascii="Arial" w:hAnsi="Arial" w:cs="Arial"/>
         </w:rPr>
-        <w:t>Faça um programa que receba o preço de custo de um produto e mostre o valor de venda. Sabe-se que o preço de custo receberá um acréscimo de acordo com um percentual informado pelo usuário.</w:t>
+        <w:t>A Treina Recife resolveu dar um desconto de 4.5% em todos os produtos comercializados em sua lojinha. Portanto, elabore um programa para receber via teclado o nome do produto e o valor atual em reais. Ao final calcule e exiba o nome do produto e o novo valor com o desconto aplicado.</w:t>
       </w:r>
     </w:p>
     <w:p>
@@ -133,7 +133,7 @@
         <w:rPr>
           <w:rFonts w:ascii="Arial" w:hAnsi="Arial" w:cs="Arial"/>
         </w:rPr>
-        <w:t>Escrever um programa que leia o nome de um vendedor, o seu salário fixo e o total de vendas efetuadas por ele no mês (em dinheiro). Sabendo que este vendedor ganha 15% de comissão sobre suas vendas efetuadas, informar o seu nome, o salário fixo e salário no final do mês.</w:t>
+        <w:t>Elabore um programa que calcule o consumo médio de um automóvel sendo fornecidos a distância total percorrida (em Km) e o total de combustível gasto (em litros), ambos, por intermédio do teclado. Sabe-se que o consumo médio de um automóvel é obtido pela razão entre a distância total percorrida e o total de combustível gasto no percurso. Portanto, apresente após o recebimento o valor que do consumo médio do automóvel, seguido da mensagem "km/l".</w:t>
       </w:r>
     </w:p>
     <w:p>
@@ -152,27 +152,151 @@
         <w:rPr>
           <w:rFonts w:ascii="Arial" w:hAnsi="Arial" w:cs="Arial"/>
         </w:rPr>
-        <w:t xml:space="preserve">O custo ao consumidor de um carro novo é a soma do custo de fábrica com a percentagem do distribuidor e dos impostos (aplicados, primeiro os impostos sobre o custo de fábrica, e depois a percentagem do distribuidor sobre o resultado). Supondo que a percentagem do distribuidor seja de 28% e os impostos 45%. Escrever um programa que leia o custo de fábrica de um carro e informe o custo ao consumidor </w:t>
-      </w:r>
-      <w:proofErr w:type="gramStart"/>
-      <w:r>
-        <w:rPr>
-          <w:rFonts w:ascii="Arial" w:hAnsi="Arial" w:cs="Arial"/>
-        </w:rPr>
-        <w:t>do mesmo</w:t>
-      </w:r>
-      <w:proofErr w:type="gramEnd"/>
-      <w:r>
-        <w:rPr>
-          <w:rFonts w:ascii="Arial" w:hAnsi="Arial" w:cs="Arial"/>
-        </w:rPr>
-        <w:t>.</w:t>
-      </w:r>
-      <w:r>
-        <w:rPr>
-          <w:rFonts w:ascii="Arial" w:hAnsi="Arial" w:cs="Arial"/>
-        </w:rPr>
-        <w:t xml:space="preserve"> </w:t>
+        <w:t xml:space="preserve">Ler uma temperatura em graus Celsius e apresentá-la convertida em graus Fahrenheit. A fórmula de conversão é: F=(9*C+160) / 5, sendo F a temperatura em Fahrenheit e C a temperatura em Celsius. </w:t>
+      </w:r>
+    </w:p>
+    <w:p>
+      <w:pPr>
+        <w:pStyle w:val="PargrafodaLista"/>
+        <w:numPr>
+          <w:ilvl w:val="0"/>
+          <w:numId w:val="1"/>
+        </w:numPr>
+        <w:autoSpaceDE w:val="0"/>
+        <w:autoSpaceDN w:val="0"/>
+        <w:adjustRightInd w:val="0"/>
+        <w:spacing w:after="0" w:line="240" w:lineRule="auto"/>
+        <w:jc w:val="both"/>
+        <w:rPr>
+          <w:rFonts w:ascii="Verdana" w:hAnsi="Verdana" w:cs="Verdana"/>
+          <w:color w:val="000000"/>
+          <w:kern w:val="0"/>
+          <w:sz w:val="22"/>
+          <w:szCs w:val="22"/>
+        </w:rPr>
+      </w:pPr>
+      <w:r>
+        <w:rPr>
+          <w:rFonts w:ascii="Arial" w:hAnsi="Arial" w:cs="Arial"/>
+        </w:rPr>
+        <w:t>Elaborar um programa que efetue a apresentação do valor da conversão em real (R$) de um valor lido em dólar (US$). O programa deverá solicitar o valor da cotação do dólar e a quantidade de dólares disponíveis com o usuário.</w:t>
+      </w:r>
+    </w:p>
+    <w:p>
+      <w:pPr>
+        <w:pStyle w:val="PargrafodaLista"/>
+        <w:numPr>
+          <w:ilvl w:val="0"/>
+          <w:numId w:val="1"/>
+        </w:numPr>
+        <w:autoSpaceDE w:val="0"/>
+        <w:autoSpaceDN w:val="0"/>
+        <w:adjustRightInd w:val="0"/>
+        <w:spacing w:after="0" w:line="240" w:lineRule="auto"/>
+        <w:jc w:val="both"/>
+        <w:rPr>
+          <w:rFonts w:ascii="Verdana" w:hAnsi="Verdana" w:cs="Verdana"/>
+          <w:color w:val="000000"/>
+          <w:kern w:val="0"/>
+          <w:sz w:val="22"/>
+          <w:szCs w:val="22"/>
+        </w:rPr>
+      </w:pPr>
+      <w:r>
+        <w:rPr>
+          <w:rFonts w:ascii="Verdana" w:hAnsi="Verdana" w:cs="Verdana"/>
+          <w:color w:val="000000"/>
+          <w:kern w:val="0"/>
+          <w:sz w:val="22"/>
+          <w:szCs w:val="22"/>
+        </w:rPr>
+        <w:t xml:space="preserve">Em um determinado concurso público são informados via teclado as quantidades de candidatos presentes do que são do sexo masculino e do sexo feminino, bem como o total dos ausentes. Pede-se calcular e exibir os percentuais solicitados abaixo: </w:t>
+      </w:r>
+    </w:p>
+    <w:p>
+      <w:pPr>
+        <w:autoSpaceDE w:val="0"/>
+        <w:autoSpaceDN w:val="0"/>
+        <w:adjustRightInd w:val="0"/>
+        <w:spacing w:after="0" w:line="240" w:lineRule="auto"/>
+        <w:ind w:left="1560" w:hanging="567"/>
+        <w:rPr>
+          <w:rFonts w:ascii="Verdana" w:hAnsi="Verdana" w:cs="Verdana"/>
+          <w:color w:val="000000"/>
+          <w:kern w:val="0"/>
+          <w:sz w:val="22"/>
+          <w:szCs w:val="22"/>
+        </w:rPr>
+      </w:pPr>
+      <w:r>
+        <w:rPr>
+          <w:rFonts w:ascii="Verdana" w:hAnsi="Verdana" w:cs="Verdana"/>
+          <w:color w:val="000000"/>
+          <w:kern w:val="0"/>
+          <w:sz w:val="22"/>
+          <w:szCs w:val="22"/>
+        </w:rPr>
+        <w:t>P1 =</w:t>
+      </w:r>
+      <w:r>
+        <w:rPr>
+          <w:rFonts w:ascii="Verdana" w:hAnsi="Verdana" w:cs="Verdana"/>
+          <w:color w:val="000000"/>
+          <w:kern w:val="0"/>
+          <w:sz w:val="22"/>
+          <w:szCs w:val="22"/>
+        </w:rPr>
+        <w:tab/>
+      </w:r>
+      <w:r>
+        <w:rPr>
+          <w:rFonts w:ascii="Verdana" w:hAnsi="Verdana" w:cs="Verdana"/>
+          <w:color w:val="000000"/>
+          <w:kern w:val="0"/>
+          <w:sz w:val="22"/>
+          <w:szCs w:val="22"/>
+        </w:rPr>
+        <w:t xml:space="preserve">O Percentual de Homens presentes em relação ao total de candidatos inscritos; </w:t>
+      </w:r>
+    </w:p>
+    <w:p>
+      <w:pPr>
+        <w:pStyle w:val="PargrafodaLista"/>
+        <w:ind w:left="1560" w:hanging="567"/>
+        <w:jc w:val="both"/>
+        <w:rPr>
+          <w:rFonts w:ascii="Arial" w:hAnsi="Arial" w:cs="Arial"/>
+        </w:rPr>
+      </w:pPr>
+      <w:r>
+        <w:rPr>
+          <w:rFonts w:ascii="Verdana" w:hAnsi="Verdana" w:cs="Verdana"/>
+          <w:color w:val="000000"/>
+          <w:kern w:val="0"/>
+          <w:sz w:val="22"/>
+          <w:szCs w:val="22"/>
+        </w:rPr>
+        <w:t>P2 =</w:t>
+      </w:r>
+      <w:r>
+        <w:rPr>
+          <w:rFonts w:ascii="Verdana" w:hAnsi="Verdana" w:cs="Verdana"/>
+          <w:color w:val="000000"/>
+          <w:kern w:val="0"/>
+          <w:sz w:val="22"/>
+          <w:szCs w:val="22"/>
+        </w:rPr>
+        <w:tab/>
+      </w:r>
+      <w:r>
+        <w:rPr>
+          <w:rFonts w:ascii="Verdana" w:hAnsi="Verdana" w:cs="Verdana"/>
+          <w:color w:val="000000"/>
+          <w:kern w:val="0"/>
+          <w:sz w:val="22"/>
+          <w:szCs w:val="22"/>
+        </w:rPr>
+        <w:t>O Percentual dos Ausentes em relação ao total dos presentes.</w:t>
       </w:r>
     </w:p>
     <w:p>
@@ -191,7 +315,8 @@
         <w:rPr>
           <w:rFonts w:ascii="Arial" w:hAnsi="Arial" w:cs="Arial"/>
         </w:rPr>
-        <w:t xml:space="preserve">Escreva um algoritmo que receba um valor numérico de 3(três) dígitos e exiba a soma dos algarismos que compõe este número. Exemplo: 145 -&gt; 1+4+5 = 10 </w:t>
+        <w:lastRenderedPageBreak/>
+        <w:t>Escrever um programa que leia o nome de um vendedor, o seu salário fixo e o total de vendas efetuadas por ele no mês (em dinheiro). Sabendo que este vendedor ganha 15% de comissão sobre suas vendas efetuadas, informar o seu nome, o salário fixo e salário no final do mês.</w:t>
       </w:r>
     </w:p>
     <w:p>
@@ -210,12 +335,536 @@
         <w:rPr>
           <w:rFonts w:ascii="Arial" w:hAnsi="Arial" w:cs="Arial"/>
         </w:rPr>
-        <w:t>Faça um programa que receba um valor que foi depositado e exiba o valor com rendimento após um mês. Considere fixo o juro da poupança em 0,50% a. m.</w:t>
+        <w:t xml:space="preserve">O custo ao consumidor de um carro novo é a soma do custo de fábrica com a percentagem do distribuidor e dos impostos (aplicados, primeiro os impostos sobre o custo de fábrica, e depois a percentagem do distribuidor sobre o resultado). Supondo que a percentagem do distribuidor seja de 28% e os impostos 45%. Escrever um programa que leia o custo de fábrica de um carro e informe o custo ao consumidor </w:t>
+      </w:r>
+      <w:proofErr w:type="gramStart"/>
+      <w:r>
+        <w:rPr>
+          <w:rFonts w:ascii="Arial" w:hAnsi="Arial" w:cs="Arial"/>
+        </w:rPr>
+        <w:t>do mesmo</w:t>
+      </w:r>
+      <w:proofErr w:type="gramEnd"/>
+      <w:r>
+        <w:rPr>
+          <w:rFonts w:ascii="Arial" w:hAnsi="Arial" w:cs="Arial"/>
+        </w:rPr>
+        <w:t>.</w:t>
+      </w:r>
+      <w:r>
+        <w:rPr>
+          <w:rFonts w:ascii="Arial" w:hAnsi="Arial" w:cs="Arial"/>
+        </w:rPr>
+        <w:t xml:space="preserve"> </w:t>
       </w:r>
     </w:p>
     <w:p>
       <w:pPr>
         <w:pStyle w:val="PargrafodaLista"/>
+        <w:numPr>
+          <w:ilvl w:val="0"/>
+          <w:numId w:val="1"/>
+        </w:numPr>
+        <w:autoSpaceDE w:val="0"/>
+        <w:autoSpaceDN w:val="0"/>
+        <w:adjustRightInd w:val="0"/>
+        <w:spacing w:after="0" w:line="240" w:lineRule="auto"/>
+        <w:jc w:val="both"/>
+        <w:rPr>
+          <w:rFonts w:ascii="Verdana" w:hAnsi="Verdana" w:cs="Verdana"/>
+          <w:color w:val="000000"/>
+          <w:kern w:val="0"/>
+          <w:sz w:val="22"/>
+          <w:szCs w:val="22"/>
+        </w:rPr>
+      </w:pPr>
+      <w:r>
+        <w:rPr>
+          <w:rFonts w:ascii="Arial" w:hAnsi="Arial" w:cs="Arial"/>
+        </w:rPr>
+        <w:t xml:space="preserve">Faça um programa para calcular e exibir o salário líquido de um determinado funcionário. Sabe-se que será informado por intermédio do teclado o salário base, as vantagens e os descontos. O salário líquido é obtido somando-se as vantagens ao salário base e abatendo-se os descontos. </w:t>
+      </w:r>
+    </w:p>
+    <w:p>
+      <w:pPr>
+        <w:pStyle w:val="PargrafodaLista"/>
+        <w:numPr>
+          <w:ilvl w:val="0"/>
+          <w:numId w:val="1"/>
+        </w:numPr>
+        <w:autoSpaceDE w:val="0"/>
+        <w:autoSpaceDN w:val="0"/>
+        <w:adjustRightInd w:val="0"/>
+        <w:spacing w:after="0" w:line="240" w:lineRule="auto"/>
+        <w:jc w:val="both"/>
+        <w:rPr>
+          <w:rFonts w:ascii="Verdana" w:hAnsi="Verdana" w:cs="Verdana"/>
+          <w:color w:val="000000"/>
+          <w:kern w:val="0"/>
+          <w:sz w:val="22"/>
+          <w:szCs w:val="22"/>
+        </w:rPr>
+      </w:pPr>
+      <w:r>
+        <w:rPr>
+          <w:rFonts w:ascii="Verdana" w:hAnsi="Verdana" w:cs="Verdana"/>
+          <w:color w:val="000000"/>
+          <w:kern w:val="0"/>
+          <w:sz w:val="22"/>
+          <w:szCs w:val="22"/>
+        </w:rPr>
+        <w:t xml:space="preserve">Sabe-se que o quilowatt de energia custa um milésimo do salário-mínimo. Elabore um programa que receba via teclado o valor do salário-mínimo e a quantidade de quilowatt consumido por uma residência. Calcule e exiba: </w:t>
+      </w:r>
+    </w:p>
+    <w:p>
+      <w:pPr>
+        <w:numPr>
+          <w:ilvl w:val="1"/>
+          <w:numId w:val="1"/>
+        </w:numPr>
+        <w:autoSpaceDE w:val="0"/>
+        <w:autoSpaceDN w:val="0"/>
+        <w:adjustRightInd w:val="0"/>
+        <w:spacing w:after="22" w:line="240" w:lineRule="auto"/>
+        <w:rPr>
+          <w:rFonts w:ascii="Verdana" w:hAnsi="Verdana" w:cs="Verdana"/>
+          <w:color w:val="000000"/>
+          <w:kern w:val="0"/>
+          <w:sz w:val="22"/>
+          <w:szCs w:val="22"/>
+        </w:rPr>
+      </w:pPr>
+      <w:r>
+        <w:rPr>
+          <w:rFonts w:ascii="Verdana" w:hAnsi="Verdana" w:cs="Verdana"/>
+          <w:color w:val="000000"/>
+          <w:kern w:val="0"/>
+          <w:sz w:val="22"/>
+          <w:szCs w:val="22"/>
+        </w:rPr>
+        <w:t xml:space="preserve">O valor em </w:t>
+      </w:r>
+      <w:proofErr w:type="gramStart"/>
+      <w:r>
+        <w:rPr>
+          <w:rFonts w:ascii="Verdana" w:hAnsi="Verdana" w:cs="Verdana"/>
+          <w:color w:val="000000"/>
+          <w:kern w:val="0"/>
+          <w:sz w:val="22"/>
+          <w:szCs w:val="22"/>
+        </w:rPr>
+        <w:t>reais ,</w:t>
+      </w:r>
+      <w:proofErr w:type="gramEnd"/>
+      <w:r>
+        <w:rPr>
+          <w:rFonts w:ascii="Verdana" w:hAnsi="Verdana" w:cs="Verdana"/>
+          <w:color w:val="000000"/>
+          <w:kern w:val="0"/>
+          <w:sz w:val="22"/>
+          <w:szCs w:val="22"/>
+        </w:rPr>
+        <w:t xml:space="preserve"> de cada quilowatt; </w:t>
+      </w:r>
+    </w:p>
+    <w:p>
+      <w:pPr>
+        <w:numPr>
+          <w:ilvl w:val="1"/>
+          <w:numId w:val="1"/>
+        </w:numPr>
+        <w:autoSpaceDE w:val="0"/>
+        <w:autoSpaceDN w:val="0"/>
+        <w:adjustRightInd w:val="0"/>
+        <w:spacing w:after="22" w:line="240" w:lineRule="auto"/>
+        <w:rPr>
+          <w:rFonts w:ascii="Verdana" w:hAnsi="Verdana" w:cs="Verdana"/>
+          <w:color w:val="000000"/>
+          <w:kern w:val="0"/>
+          <w:sz w:val="22"/>
+          <w:szCs w:val="22"/>
+        </w:rPr>
+      </w:pPr>
+      <w:r>
+        <w:rPr>
+          <w:rFonts w:ascii="Verdana" w:hAnsi="Verdana" w:cs="Verdana"/>
+          <w:color w:val="000000"/>
+          <w:kern w:val="0"/>
+          <w:sz w:val="22"/>
+          <w:szCs w:val="22"/>
+        </w:rPr>
+        <w:t xml:space="preserve">O valor da conta, em </w:t>
+      </w:r>
+      <w:proofErr w:type="gramStart"/>
+      <w:r>
+        <w:rPr>
+          <w:rFonts w:ascii="Verdana" w:hAnsi="Verdana" w:cs="Verdana"/>
+          <w:color w:val="000000"/>
+          <w:kern w:val="0"/>
+          <w:sz w:val="22"/>
+          <w:szCs w:val="22"/>
+        </w:rPr>
+        <w:t>reais ,</w:t>
+      </w:r>
+      <w:proofErr w:type="gramEnd"/>
+      <w:r>
+        <w:rPr>
+          <w:rFonts w:ascii="Verdana" w:hAnsi="Verdana" w:cs="Verdana"/>
+          <w:color w:val="000000"/>
+          <w:kern w:val="0"/>
+          <w:sz w:val="22"/>
+          <w:szCs w:val="22"/>
+        </w:rPr>
+        <w:t xml:space="preserve"> a ser pago por essa residência; </w:t>
+      </w:r>
+    </w:p>
+    <w:p>
+      <w:pPr>
+        <w:numPr>
+          <w:ilvl w:val="1"/>
+          <w:numId w:val="1"/>
+        </w:numPr>
+        <w:autoSpaceDE w:val="0"/>
+        <w:autoSpaceDN w:val="0"/>
+        <w:adjustRightInd w:val="0"/>
+        <w:spacing w:after="0" w:line="240" w:lineRule="auto"/>
+        <w:jc w:val="both"/>
+        <w:rPr>
+          <w:rFonts w:ascii="Arial" w:hAnsi="Arial" w:cs="Arial"/>
+        </w:rPr>
+      </w:pPr>
+      <w:r>
+        <w:rPr>
+          <w:rFonts w:ascii="Verdana" w:hAnsi="Verdana" w:cs="Verdana"/>
+          <w:color w:val="000000"/>
+          <w:kern w:val="0"/>
+          <w:sz w:val="22"/>
+          <w:szCs w:val="22"/>
+        </w:rPr>
+        <w:t xml:space="preserve">O valor da conta com desconto de 15 % </w:t>
+      </w:r>
+    </w:p>
+    <w:p>
+      <w:pPr>
+        <w:numPr>
+          <w:ilvl w:val="0"/>
+          <w:numId w:val="1"/>
+        </w:numPr>
+        <w:autoSpaceDE w:val="0"/>
+        <w:autoSpaceDN w:val="0"/>
+        <w:adjustRightInd w:val="0"/>
+        <w:spacing w:after="0" w:line="240" w:lineRule="auto"/>
+        <w:jc w:val="both"/>
+        <w:rPr>
+          <w:rFonts w:ascii="Arial" w:hAnsi="Arial" w:cs="Arial"/>
+        </w:rPr>
+      </w:pPr>
+      <w:r>
+        <w:rPr>
+          <w:rFonts w:ascii="Arial" w:hAnsi="Arial" w:cs="Arial"/>
+        </w:rPr>
+        <w:t xml:space="preserve">A empresa Show Life apresenta show ao vivo em qualquer local que for solicitado. Cada show é cobrado por hora de apresentação mais um valor cobrado pelo deslocamento de R$ 50.00 por quilometro conforme a distância. A Show Life paga ao veículo, que faz o transporte dos equipamentos e de pessoal, um frete de 35% sobre o valor cobrado pela distância calculado anteriormente. Elabore um programa que receba via teclado distância em </w:t>
+      </w:r>
+      <w:proofErr w:type="gramStart"/>
+      <w:r>
+        <w:rPr>
+          <w:rFonts w:ascii="Arial" w:hAnsi="Arial" w:cs="Arial"/>
+        </w:rPr>
+        <w:t>quilometro ,</w:t>
+      </w:r>
+      <w:proofErr w:type="gramEnd"/>
+      <w:r>
+        <w:rPr>
+          <w:rFonts w:ascii="Arial" w:hAnsi="Arial" w:cs="Arial"/>
+        </w:rPr>
+        <w:t xml:space="preserve"> o valor em reais de cada hora da banda e a duração em horas do show. Ao final calcular e exibir o valor do show e o valor do frete a ser pago ao transportador.</w:t>
+      </w:r>
+    </w:p>
+    <w:p>
+      <w:pPr>
+        <w:numPr>
+          <w:ilvl w:val="0"/>
+          <w:numId w:val="1"/>
+        </w:numPr>
+        <w:autoSpaceDE w:val="0"/>
+        <w:autoSpaceDN w:val="0"/>
+        <w:adjustRightInd w:val="0"/>
+        <w:spacing w:after="0" w:line="240" w:lineRule="auto"/>
+        <w:jc w:val="both"/>
+        <w:rPr>
+          <w:rFonts w:ascii="Arial" w:hAnsi="Arial" w:cs="Arial"/>
+        </w:rPr>
+      </w:pPr>
+      <w:r>
+        <w:rPr>
+          <w:rFonts w:ascii="Arial" w:hAnsi="Arial" w:cs="Arial"/>
+        </w:rPr>
+        <w:t>A energia da área comum e a água consumida pelos moradores do Edifício Prata Nobre é rateado entre os apartamentos. Escreva um programa que receba a quantidade de apartamentos, valor da conta de energia e valor da conta de água, calcule o rateio entre os apartamentos e mostre o valor total que cada apartamento deve pagar;</w:t>
+      </w:r>
+    </w:p>
+    <w:p>
+      <w:pPr>
+        <w:numPr>
+          <w:ilvl w:val="0"/>
+          <w:numId w:val="1"/>
+        </w:numPr>
+        <w:autoSpaceDE w:val="0"/>
+        <w:autoSpaceDN w:val="0"/>
+        <w:adjustRightInd w:val="0"/>
+        <w:spacing w:after="0" w:line="240" w:lineRule="auto"/>
+        <w:jc w:val="both"/>
+        <w:rPr>
+          <w:rFonts w:ascii="Arial" w:hAnsi="Arial" w:cs="Arial"/>
+        </w:rPr>
+      </w:pPr>
+      <w:r>
+        <w:rPr>
+          <w:rFonts w:ascii="Arial" w:hAnsi="Arial" w:cs="Arial"/>
+        </w:rPr>
+        <w:t>Uma loja oferece uma promoção: na compra de 3 produtos, o terceiro é 50% mais barato. Faça um programa que leia o preço de 3 produtos e calcule o valor total considerando a promoção.</w:t>
+      </w:r>
+    </w:p>
+    <w:p>
+      <w:pPr>
+        <w:numPr>
+          <w:ilvl w:val="0"/>
+          <w:numId w:val="1"/>
+        </w:numPr>
+        <w:autoSpaceDE w:val="0"/>
+        <w:autoSpaceDN w:val="0"/>
+        <w:adjustRightInd w:val="0"/>
+        <w:spacing w:after="0" w:line="240" w:lineRule="auto"/>
+        <w:jc w:val="both"/>
+        <w:rPr>
+          <w:rFonts w:ascii="Arial" w:hAnsi="Arial" w:cs="Arial"/>
+        </w:rPr>
+      </w:pPr>
+      <w:r>
+        <w:rPr>
+          <w:rFonts w:ascii="Arial" w:hAnsi="Arial" w:cs="Arial"/>
+        </w:rPr>
+        <w:t>Faça um programa que receba a soma de todas as verbas recebidas por um funcionário no mês, em uma variável do tipo real denominada Salário Bruto. Após o recebimento calcule</w:t>
+      </w:r>
+      <w:r>
+        <w:rPr>
+          <w:rFonts w:ascii="Arial" w:hAnsi="Arial" w:cs="Arial"/>
+        </w:rPr>
+        <w:t xml:space="preserve"> </w:t>
+      </w:r>
+      <w:r>
+        <w:rPr>
+          <w:rFonts w:ascii="Arial" w:hAnsi="Arial" w:cs="Arial"/>
+        </w:rPr>
+        <w:t>e exiba na tela o valor do imposto de renda, o valor do INSS e o salário líquido que é obtido abatendo-se do Salário Bruto da soma dos</w:t>
+      </w:r>
+      <w:r>
+        <w:rPr>
+          <w:rFonts w:ascii="Arial" w:hAnsi="Arial" w:cs="Arial"/>
+        </w:rPr>
+        <w:t xml:space="preserve"> </w:t>
+      </w:r>
+      <w:r>
+        <w:rPr>
+          <w:rFonts w:ascii="Arial" w:hAnsi="Arial" w:cs="Arial"/>
+        </w:rPr>
+        <w:t>descontos descritos na tabela abaixo</w:t>
+      </w:r>
+      <w:r>
+        <w:rPr>
+          <w:rFonts w:ascii="Arial" w:hAnsi="Arial" w:cs="Arial"/>
+        </w:rPr>
+        <w:t>:</w:t>
+      </w:r>
+    </w:p>
+    <w:tbl>
+      <w:tblPr>
+        <w:tblStyle w:val="Tabelacomgrade"/>
+        <w:tblW w:w="0" w:type="auto"/>
+        <w:tblInd w:w="720" w:type="dxa"/>
+        <w:tblLook w:val="04A0" w:firstRow="1" w:lastRow="0" w:firstColumn="1" w:lastColumn="0" w:noHBand="0" w:noVBand="1"/>
+      </w:tblPr>
+      <w:tblGrid>
+        <w:gridCol w:w="1685"/>
+        <w:gridCol w:w="6089"/>
+      </w:tblGrid>
+      <w:tr>
+        <w:tc>
+          <w:tcPr>
+            <w:tcW w:w="1685" w:type="dxa"/>
+            <w:vMerge w:val="restart"/>
+            <w:vAlign w:val="center"/>
+          </w:tcPr>
+          <w:p>
+            <w:pPr>
+              <w:autoSpaceDE w:val="0"/>
+              <w:autoSpaceDN w:val="0"/>
+              <w:adjustRightInd w:val="0"/>
+              <w:jc w:val="both"/>
+              <w:rPr>
+                <w:rFonts w:ascii="Arial" w:hAnsi="Arial" w:cs="Arial"/>
+              </w:rPr>
+            </w:pPr>
+            <w:r>
+              <w:rPr>
+                <w:rFonts w:ascii="Arial" w:hAnsi="Arial" w:cs="Arial"/>
+              </w:rPr>
+              <w:t>Descontos</w:t>
+            </w:r>
+          </w:p>
+        </w:tc>
+        <w:tc>
+          <w:tcPr>
+            <w:tcW w:w="6089" w:type="dxa"/>
+          </w:tcPr>
+          <w:p>
+            <w:pPr>
+              <w:pStyle w:val="Default"/>
+              <w:jc w:val="both"/>
+              <w:rPr>
+                <w:sz w:val="22"/>
+                <w:szCs w:val="22"/>
+              </w:rPr>
+            </w:pPr>
+            <w:r>
+              <w:rPr>
+                <w:sz w:val="22"/>
+                <w:szCs w:val="22"/>
+              </w:rPr>
+              <w:t xml:space="preserve">Imposto de Renda: </w:t>
+            </w:r>
+            <w:proofErr w:type="spellStart"/>
+            <w:r>
+              <w:rPr>
+                <w:b/>
+                <w:bCs/>
+                <w:sz w:val="22"/>
+                <w:szCs w:val="22"/>
+              </w:rPr>
+              <w:t>Valor_IR</w:t>
+            </w:r>
+            <w:proofErr w:type="spellEnd"/>
+            <w:r>
+              <w:rPr>
+                <w:b/>
+                <w:bCs/>
+                <w:sz w:val="22"/>
+                <w:szCs w:val="22"/>
+              </w:rPr>
+              <w:t xml:space="preserve"> </w:t>
+            </w:r>
+            <w:r>
+              <w:rPr>
+                <w:sz w:val="28"/>
+                <w:szCs w:val="28"/>
+              </w:rPr>
+              <w:t>→</w:t>
+            </w:r>
+            <w:r>
+              <w:rPr>
+                <w:sz w:val="28"/>
+                <w:szCs w:val="28"/>
+              </w:rPr>
+              <w:t xml:space="preserve"> </w:t>
+            </w:r>
+            <w:r>
+              <w:rPr>
+                <w:sz w:val="22"/>
+                <w:szCs w:val="22"/>
+              </w:rPr>
+              <w:t>5% do Salário Bruto</w:t>
+            </w:r>
+          </w:p>
+        </w:tc>
+      </w:tr>
+      <w:tr>
+        <w:tc>
+          <w:tcPr>
+            <w:tcW w:w="1685" w:type="dxa"/>
+            <w:vMerge/>
+          </w:tcPr>
+          <w:p>
+            <w:pPr>
+              <w:autoSpaceDE w:val="0"/>
+              <w:autoSpaceDN w:val="0"/>
+              <w:adjustRightInd w:val="0"/>
+              <w:jc w:val="both"/>
+              <w:rPr>
+                <w:rFonts w:ascii="Arial" w:hAnsi="Arial" w:cs="Arial"/>
+              </w:rPr>
+            </w:pPr>
+          </w:p>
+        </w:tc>
+        <w:tc>
+          <w:tcPr>
+            <w:tcW w:w="6089" w:type="dxa"/>
+          </w:tcPr>
+          <w:p>
+            <w:pPr>
+              <w:pStyle w:val="Default"/>
+              <w:jc w:val="both"/>
+              <w:rPr>
+                <w:sz w:val="22"/>
+                <w:szCs w:val="22"/>
+              </w:rPr>
+            </w:pPr>
+            <w:r>
+              <w:rPr>
+                <w:sz w:val="22"/>
+                <w:szCs w:val="22"/>
+              </w:rPr>
+              <w:t xml:space="preserve">INSS: </w:t>
+            </w:r>
+            <w:proofErr w:type="spellStart"/>
+            <w:r>
+              <w:rPr>
+                <w:b/>
+                <w:bCs/>
+                <w:sz w:val="22"/>
+                <w:szCs w:val="22"/>
+              </w:rPr>
+              <w:t>Valor_INSS</w:t>
+            </w:r>
+            <w:proofErr w:type="spellEnd"/>
+            <w:r>
+              <w:rPr>
+                <w:b/>
+                <w:bCs/>
+                <w:sz w:val="22"/>
+                <w:szCs w:val="22"/>
+              </w:rPr>
+              <w:t xml:space="preserve"> </w:t>
+            </w:r>
+            <w:r>
+              <w:rPr>
+                <w:sz w:val="28"/>
+                <w:szCs w:val="28"/>
+              </w:rPr>
+              <w:t>→</w:t>
+            </w:r>
+            <w:r>
+              <w:rPr>
+                <w:sz w:val="28"/>
+                <w:szCs w:val="28"/>
+              </w:rPr>
+              <w:t xml:space="preserve"> </w:t>
+            </w:r>
+            <w:r>
+              <w:rPr>
+                <w:sz w:val="22"/>
+                <w:szCs w:val="22"/>
+              </w:rPr>
+              <w:t xml:space="preserve">11% do Salário Bruto </w:t>
+            </w:r>
+          </w:p>
+        </w:tc>
+      </w:tr>
+    </w:tbl>
+    <w:p>
+      <w:pPr>
+        <w:autoSpaceDE w:val="0"/>
+        <w:autoSpaceDN w:val="0"/>
+        <w:adjustRightInd w:val="0"/>
+        <w:spacing w:after="0" w:line="240" w:lineRule="auto"/>
         <w:jc w:val="both"/>
         <w:rPr>
           <w:rFonts w:ascii="Arial" w:hAnsi="Arial" w:cs="Arial"/>
@@ -851,9 +1500,60 @@
 <file path=word/numbering.xml><?xml version="1.0" encoding="utf-8"?>
 <w:numbering xmlns:wpc="http://schemas.microsoft.com/office/word/2010/wordprocessingCanvas" xmlns:cx="http://schemas.microsoft.com/office/drawing/2014/chartex" xmlns:cx1="http://schemas.microsoft.com/office/drawing/2015/9/8/chartex" xmlns:cx2="http://schemas.microsoft.com/office/drawing/2015/10/21/chartex" xmlns:cx3="http://schemas.microsoft.com/office/drawing/2016/5/9/chartex" xmlns:cx4="http://schemas.microsoft.com/office/drawing/2016/5/10/chartex" xmlns:cx5="http://schemas.microsoft.com/office/drawing/2016/5/11/chartex" xmlns:cx6="http://schemas.microsoft.com/office/drawing/2016/5/12/chartex" xmlns:cx7="http://schemas.microsoft.com/office/drawing/2016/5/13/chartex" xmlns:cx8="http://schemas.microsoft.com/office/drawing/2016/5/14/chartex" xmlns:mc="http://schemas.openxmlformats.org/markup-compatibility/2006" xmlns:aink="http://schemas.microsoft.com/office/drawing/2016/ink" xmlns:am3d="http://schemas.microsoft.com/office/drawing/2017/model3d" xmlns:o="urn:schemas-microsoft-com:office:office" xmlns:oel="http://schemas.microsoft.com/office/2019/extlst" xmlns:r="http://schemas.openxmlformats.org/officeDocument/2006/relationships" xmlns:m="http://schemas.openxmlformats.org/officeDocument/2006/math" xmlns:v="urn:schemas-microsoft-com:vml" xmlns:wp14="http://schemas.microsoft.com/office/word/2010/wordprocessingDrawing" xmlns:wp="http://schemas.openxmlformats.org/drawingml/2006/wordprocessingDrawing" xmlns:w10="urn:schemas-microsoft-com:office:word" xmlns:w="http://schemas.openxmlformats.org/wordprocessingml/2006/main" xmlns:w14="http://schemas.microsoft.com/office/word/2010/wordml" xmlns:w15="http://schemas.microsoft.com/office/word/2012/wordml" xmlns:w16cex="http://schemas.microsoft.com/office/word/2018/wordml/cex" xmlns:w16cid="http://schemas.microsoft.com/office/word/2016/wordml/cid" xmlns:w16="http://schemas.microsoft.com/office/word/2018/wordml" xmlns:w16du="http://schemas.microsoft.com/office/word/2023/wordml/word16du" xmlns:w16sdtdh="http://schemas.microsoft.com/office/word/2020/wordml/sdtdatahash" xmlns:w16sdtfl="http://schemas.microsoft.com/office/word/2024/wordml/sdtformatlock" xmlns:w16se="http://schemas.microsoft.com/office/word/2015/wordml/symex" xmlns:wpg="http://schemas.microsoft.com/office/word/2010/wordprocessingGroup" xmlns:wpi="http://schemas.microsoft.com/office/word/2010/wordprocessingInk" xmlns:wne="http://schemas.microsoft.com/office/word/2006/wordml" xmlns:wps="http://schemas.microsoft.com/office/word/2010/wordprocessingShape" mc:Ignorable="w14 w15 w16se w16cid w16 w16cex w16sdtdh w16sdtfl w16du wp14">
   <w:abstractNum w:abstractNumId="0" w15:restartNumberingAfterBreak="0">
+    <w:nsid w:val="D7C6A347"/>
+    <w:multiLevelType w:val="hybridMultilevel"/>
+    <w:tmpl w:val="FFFFFFFF"/>
+    <w:lvl w:ilvl="0" w:tplc="FFFFFFFF">
+      <w:start w:val="1"/>
+      <w:numFmt w:val="decimal"/>
+      <w:lvlText w:val=""/>
+      <w:lvlJc w:val="left"/>
+    </w:lvl>
+    <w:lvl w:ilvl="1" w:tplc="FFFFFFFF">
+      <w:numFmt w:val="decimal"/>
+      <w:lvlText w:val=""/>
+      <w:lvlJc w:val="left"/>
+    </w:lvl>
+    <w:lvl w:ilvl="2" w:tplc="FFFFFFFF">
+      <w:numFmt w:val="decimal"/>
+      <w:lvlText w:val=""/>
+      <w:lvlJc w:val="left"/>
+    </w:lvl>
+    <w:lvl w:ilvl="3" w:tplc="FFFFFFFF">
+      <w:numFmt w:val="decimal"/>
+      <w:lvlText w:val=""/>
+      <w:lvlJc w:val="left"/>
+    </w:lvl>
+    <w:lvl w:ilvl="4" w:tplc="FFFFFFFF">
+      <w:numFmt w:val="decimal"/>
+      <w:lvlText w:val=""/>
+      <w:lvlJc w:val="left"/>
+    </w:lvl>
+    <w:lvl w:ilvl="5" w:tplc="FFFFFFFF">
+      <w:numFmt w:val="decimal"/>
+      <w:lvlText w:val=""/>
+      <w:lvlJc w:val="left"/>
+    </w:lvl>
+    <w:lvl w:ilvl="6" w:tplc="FFFFFFFF">
+      <w:numFmt w:val="decimal"/>
+      <w:lvlText w:val=""/>
+      <w:lvlJc w:val="left"/>
+    </w:lvl>
+    <w:lvl w:ilvl="7" w:tplc="FFFFFFFF">
+      <w:numFmt w:val="decimal"/>
+      <w:lvlText w:val=""/>
+      <w:lvlJc w:val="left"/>
+    </w:lvl>
+    <w:lvl w:ilvl="8" w:tplc="FFFFFFFF">
+      <w:numFmt w:val="decimal"/>
+      <w:lvlText w:val=""/>
+      <w:lvlJc w:val="left"/>
+    </w:lvl>
+  </w:abstractNum>
+  <w:abstractNum w:abstractNumId="1" w15:restartNumberingAfterBreak="0">
     <w:nsid w:val="0A4D6DD7"/>
     <w:multiLevelType w:val="hybridMultilevel"/>
-    <w:tmpl w:val="48EE37AA"/>
+    <w:tmpl w:val="6478B6BC"/>
     <w:lvl w:ilvl="0" w:tplc="0416000F">
       <w:start w:val="1"/>
       <w:numFmt w:val="decimal"/>
@@ -863,7 +1563,7 @@
         <w:ind w:left="720" w:hanging="360"/>
       </w:pPr>
     </w:lvl>
-    <w:lvl w:ilvl="1" w:tplc="04160019" w:tentative="1">
+    <w:lvl w:ilvl="1" w:tplc="04160019">
       <w:start w:val="1"/>
       <w:numFmt w:val="lowerLetter"/>
       <w:lvlText w:val="%2."/>
@@ -936,7 +1636,99 @@
       </w:pPr>
     </w:lvl>
   </w:abstractNum>
+  <w:abstractNum w:abstractNumId="2" w15:restartNumberingAfterBreak="0">
+    <w:nsid w:val="3BF61A0A"/>
+    <w:multiLevelType w:val="hybridMultilevel"/>
+    <w:tmpl w:val="48EE37AA"/>
+    <w:lvl w:ilvl="0" w:tplc="FFFFFFFF">
+      <w:start w:val="1"/>
+      <w:numFmt w:val="decimal"/>
+      <w:lvlText w:val="%1."/>
+      <w:lvlJc w:val="left"/>
+      <w:pPr>
+        <w:ind w:left="720" w:hanging="360"/>
+      </w:pPr>
+    </w:lvl>
+    <w:lvl w:ilvl="1" w:tplc="FFFFFFFF" w:tentative="1">
+      <w:start w:val="1"/>
+      <w:numFmt w:val="lowerLetter"/>
+      <w:lvlText w:val="%2."/>
+      <w:lvlJc w:val="left"/>
+      <w:pPr>
+        <w:ind w:left="1440" w:hanging="360"/>
+      </w:pPr>
+    </w:lvl>
+    <w:lvl w:ilvl="2" w:tplc="FFFFFFFF" w:tentative="1">
+      <w:start w:val="1"/>
+      <w:numFmt w:val="lowerRoman"/>
+      <w:lvlText w:val="%3."/>
+      <w:lvlJc w:val="right"/>
+      <w:pPr>
+        <w:ind w:left="2160" w:hanging="180"/>
+      </w:pPr>
+    </w:lvl>
+    <w:lvl w:ilvl="3" w:tplc="FFFFFFFF" w:tentative="1">
+      <w:start w:val="1"/>
+      <w:numFmt w:val="decimal"/>
+      <w:lvlText w:val="%4."/>
+      <w:lvlJc w:val="left"/>
+      <w:pPr>
+        <w:ind w:left="2880" w:hanging="360"/>
+      </w:pPr>
+    </w:lvl>
+    <w:lvl w:ilvl="4" w:tplc="FFFFFFFF" w:tentative="1">
+      <w:start w:val="1"/>
+      <w:numFmt w:val="lowerLetter"/>
+      <w:lvlText w:val="%5."/>
+      <w:lvlJc w:val="left"/>
+      <w:pPr>
+        <w:ind w:left="3600" w:hanging="360"/>
+      </w:pPr>
+    </w:lvl>
+    <w:lvl w:ilvl="5" w:tplc="FFFFFFFF" w:tentative="1">
+      <w:start w:val="1"/>
+      <w:numFmt w:val="lowerRoman"/>
+      <w:lvlText w:val="%6."/>
+      <w:lvlJc w:val="right"/>
+      <w:pPr>
+        <w:ind w:left="4320" w:hanging="180"/>
+      </w:pPr>
+    </w:lvl>
+    <w:lvl w:ilvl="6" w:tplc="FFFFFFFF" w:tentative="1">
+      <w:start w:val="1"/>
+      <w:numFmt w:val="decimal"/>
+      <w:lvlText w:val="%7."/>
+      <w:lvlJc w:val="left"/>
+      <w:pPr>
+        <w:ind w:left="5040" w:hanging="360"/>
+      </w:pPr>
+    </w:lvl>
+    <w:lvl w:ilvl="7" w:tplc="FFFFFFFF" w:tentative="1">
+      <w:start w:val="1"/>
+      <w:numFmt w:val="lowerLetter"/>
+      <w:lvlText w:val="%8."/>
+      <w:lvlJc w:val="left"/>
+      <w:pPr>
+        <w:ind w:left="5760" w:hanging="360"/>
+      </w:pPr>
+    </w:lvl>
+    <w:lvl w:ilvl="8" w:tplc="FFFFFFFF" w:tentative="1">
+      <w:start w:val="1"/>
+      <w:numFmt w:val="lowerRoman"/>
+      <w:lvlText w:val="%9."/>
+      <w:lvlJc w:val="right"/>
+      <w:pPr>
+        <w:ind w:left="6480" w:hanging="180"/>
+      </w:pPr>
+    </w:lvl>
+  </w:abstractNum>
   <w:num w:numId="1" w16cid:durableId="1593932838">
+    <w:abstractNumId w:val="1"/>
+  </w:num>
+  <w:num w:numId="2" w16cid:durableId="440684325">
+    <w:abstractNumId w:val="2"/>
+  </w:num>
+  <w:num w:numId="3" w16cid:durableId="1559124008">
     <w:abstractNumId w:val="0"/>
   </w:num>
 </w:numbering>
@@ -1545,7 +2337,6 @@
   <w:style w:type="character" w:default="1" w:styleId="Fontepargpadro">
     <w:name w:val="Default Paragraph Font"/>
     <w:uiPriority w:val="1"/>
-    <w:semiHidden/>
     <w:unhideWhenUsed/>
   </w:style>
   <w:style w:type="table" w:default="1" w:styleId="Tabelanormal">

</xml_diff>